<commit_message>
Lito Sousa: revisão crítica da Parte 4
Co-Authored-By: Claude Opus 5.5 <noreply@anthropic.com>
Claude-Session: https://claude.ai/code/session_01MJjUEEZrxQDEUifKK2vj9g
</commit_message>
<xml_diff>
--- a/roteiros/lito-sousa/LitoSousa_Parte4.docx
+++ b/roteiros/lito-sousa/LitoSousa_Parte4.docx
@@ -47,7 +47,7 @@
         <w:rPr>
           <w:color w:val="000000"/>
         </w:rPr>
-        <w:t>Para que aquela caixa saísse do avião sem perder horas na burocracia, a família tinha montado uma operação com a Receita Federal, a Anvisa, a Polícia Federal e uma empresa de táxi aéreo.</w:t>
+        <w:t>Para que aquela caixa saísse do avião sem perder horas na burocracia, uma operação reuniu a Receita Federal, a Anvisa, a Polícia Federal e uma empresa de táxi aéreo.</w:t>
       </w:r>
     </w:p>
     <w:p>
@@ -79,7 +79,7 @@
         <w:rPr>
           <w:color w:val="000000"/>
         </w:rPr>
-        <w:t>O homem que passou a vida falando de aviões que transportavam vidas agora esperava, deitado num leito, uma aeronave que transportava a dele.</w:t>
+        <w:t>O homem que passou a vida falando de aviões que transportavam vidas agora esperava, deitado num leito, uma aeronave que trazia a última esperança dele.</w:t>
       </w:r>
     </w:p>
     <w:p>
@@ -175,7 +175,7 @@
         <w:rPr>
           <w:color w:val="1F4EB4"/>
         </w:rPr>
-        <w:t>Vinte e um de setembro.</w:t>
+        <w:t>Por volta de vinte e um de setembro.</w:t>
       </w:r>
     </w:p>
     <w:p>
@@ -247,7 +247,7 @@
         <w:rPr>
           <w:color w:val="1F4EB4"/>
         </w:rPr>
-        <w:t>Numa conversa nas redes, Mila falou sobre algo que os médicos tinham alertado. A chamada síndrome do cuidador. Quando quem cuida de um doente grave para de dormir, para de comer direito e acaba adoecendo também.</w:t>
+        <w:t>Numa publicação nas redes, Mila falou sobre algo que os médicos tinham alertado. A chamada síndrome do cuidador. Quando quem cuida de um doente grave para de dormir, para de comer direito e acaba adoecendo também.</w:t>
       </w:r>
     </w:p>
     <w:p>
@@ -279,7 +279,7 @@
         <w:rPr>
           <w:color w:val="1F4EB4"/>
         </w:rPr>
-        <w:t>Os ataques vieram em massa.</w:t>
+        <w:t>As críticas vieram em peso.</w:t>
       </w:r>
     </w:p>
     <w:p>
@@ -351,7 +351,7 @@
         <w:rPr>
           <w:color w:val="000000"/>
         </w:rPr>
-        <w:t>Dois dias depois, começou a circular nas redes uma publicação dizendo que Lito tinha recuperado os movimentos de uma das mãos.</w:t>
+        <w:t>Nos dias seguintes, começou a circular nas redes uma publicação dizendo que Lito tinha recuperado os movimentos de uma das mãos.</w:t>
       </w:r>
     </w:p>
     <w:p>
@@ -423,7 +423,7 @@
         <w:rPr>
           <w:color w:val="C00000"/>
         </w:rPr>
-        <w:t>Zero. Em julho, o próprio Lito tinha dito aos seguidores: estou em manutenção, não em queda. E daquela outra, dita em casa? Eu vou ser o primeiro a controlar essa doença no mundo. Três dias depois do zero de Mila, o perfil dele ia publicar um vídeo que parecia responder a essas duas frases. E o Brasil inteiro ia se perguntar o que estava vendo.</w:t>
+        <w:t>Zero. Em julho, o próprio Lito tinha dito aos seguidores que estava em manutenção, não em queda. Em casa, tinha prometido ser o primeiro a controlar essa doença no mundo. Três dias depois do zero de Mila, o perfil dele ia publicar um vídeo que parecia desmentir tudo o que ela tinha dito. E o Brasil inteiro ia se perguntar o que estava vendo.</w:t>
       </w:r>
     </w:p>
     <w:sectPr>

</xml_diff>